<commit_message>
feat: generate CV from approved profile data
</commit_message>
<xml_diff>
--- a/public/cv/Dessi_Georgieva_CV.docx
+++ b/public/cv/Dessi_Georgieva_CV.docx
@@ -97,7 +97,7 @@
             <w:color w:val="2E74B5"/>
             <w:u w:val="single"/>
           </w:rPr>
-          <w:t>AI Knowledge Hub</w:t>
+          <w:t>ai-knowledge-hub</w:t>
         </w:r>
       </w:hyperlink>
     </w:p>
@@ -222,7 +222,7 @@
         <w:pStyle w:val="Heading2"/>
       </w:pPr>
       <w:r>
-        <w:t>Agentic Commerce Control Plane</w:t>
+        <w:t>Agentic Commerce Learning Loop</w:t>
       </w:r>
     </w:p>
     <w:p>
@@ -233,7 +233,7 @@
         <w:rPr>
           <w:i/>
         </w:rPr>
-        <w:t xml:space="preserve">Collaborative public engineering project · Active development · </w:t>
+        <w:t xml:space="preserve">Collaborative public system · Active · </w:t>
       </w:r>
       <w:hyperlink r:id="rId15">
         <w:r>
@@ -257,7 +257,7 @@
         <w:rPr>
           <w:i w:val="0"/>
         </w:rPr>
-        <w:t>Designed supervised agent execution with registry-pinned tools, principal-aware policy checks, immutable receipts, and explicit approve, pause, retry, and recovery transitions.</w:t>
+        <w:t>Designed a supervised agent runtime with registry-pinned tools, policy preflight, immutable events, recovery paths, and external-agent job receipts.</w:t>
       </w:r>
     </w:p>
     <w:p>
@@ -271,7 +271,7 @@
         <w:rPr>
           <w:i w:val="0"/>
         </w:rPr>
-        <w:t>Built a governed feedback loop with more than 280 Python test functions across policy, replay, recovery, validation, and receipt integrity.</w:t>
+        <w:t>Built a governed feedback loop that separates synthetic validation, observed outcomes, belief revision, and human approval.</w:t>
       </w:r>
     </w:p>
     <w:p>
@@ -290,7 +290,7 @@
         <w:rPr>
           <w:i/>
         </w:rPr>
-        <w:t xml:space="preserve">OpenAI Build Week submission · Submitted state frozen during judging · </w:t>
+        <w:t xml:space="preserve">Submitted public system · Judging state preserved · </w:t>
       </w:r>
       <w:hyperlink r:id="rId16">
         <w:r>
@@ -314,7 +314,7 @@
         <w:rPr>
           <w:i w:val="0"/>
         </w:rPr>
-        <w:t>Built an append-only evidence ledger and deterministic projections that separate sources, human understanding, shared theory, agent memory, and capability state.</w:t>
+        <w:t>Built an evaluated, approval-gated Codex capability backed by append-only evidence and deterministic projections.</w:t>
       </w:r>
     </w:p>
     <w:p>
@@ -328,7 +328,7 @@
         <w:rPr>
           <w:i w:val="0"/>
         </w:rPr>
-        <w:t>Implemented and evaluated a consent-gated Codex capability with reviewable activation, provenance, IPC, accessibility, and fallback tests.</w:t>
+        <w:t>Append-only evidence and deterministic projections preserve provenance.</w:t>
       </w:r>
     </w:p>
     <w:p>
@@ -336,7 +336,7 @@
         <w:pStyle w:val="Heading2"/>
       </w:pPr>
       <w:r>
-        <w:t>DG-OS Agent Runtime</w:t>
+        <w:t>DG-OS</w:t>
       </w:r>
     </w:p>
     <w:p>
@@ -359,22 +359,6 @@
           <w:t>Portfolio</w:t>
         </w:r>
       </w:hyperlink>
-      <w:r>
-        <w:rPr>
-          <w:i/>
-        </w:rPr>
-        <w:t xml:space="preserve"> · </w:t>
-      </w:r>
-      <w:hyperlink r:id="rId17">
-        <w:r>
-          <w:rPr>
-            <w:color w:val="2E74B5"/>
-            <w:u w:val="single"/>
-            <w:i/>
-          </w:rPr>
-          <w:t>Repository</w:t>
-        </w:r>
-      </w:hyperlink>
     </w:p>
     <w:p>
       <w:pPr>
@@ -387,7 +371,7 @@
         <w:rPr>
           <w:i w:val="0"/>
         </w:rPr>
-        <w:t>Built a retrieval-backed agent interface with deterministic commands, provider adapters, streaming contracts, health checks, and explicit fallbacks.</w:t>
+        <w:t>Built a retrieval-backed agent interface with multiple provider adapters, streaming contracts, health checks, and explicit fallback controls.</w:t>
       </w:r>
     </w:p>
     <w:p>
@@ -401,7 +385,7 @@
         <w:rPr>
           <w:i w:val="0"/>
         </w:rPr>
-        <w:t>Added source-aware diagnostics and more than 180 TypeScript test declarations covering routing, context, streaming, provider health, and desktop state.</w:t>
+        <w:t>Represents claims with provenance, confidence, visibility, and boundaries.</w:t>
       </w:r>
     </w:p>
     <w:p>
@@ -440,7 +424,7 @@
         <w:rPr>
           <w:i w:val="0"/>
         </w:rPr>
-        <w:t xml:space="preserve"> · London · Nov 2023 – Present</w:t>
+        <w:t xml:space="preserve"> · London · Nov 2023 - Present</w:t>
       </w:r>
     </w:p>
     <w:p>
@@ -468,7 +452,7 @@
         <w:rPr>
           <w:i w:val="0"/>
         </w:rPr>
-        <w:t>Delivered backend services and data workflows for an award-recognised ecommerce optimisation platform using FastAPI, AWS Glue, Lambda, and PostgreSQL.</w:t>
+        <w:t>Delivered FastAPI services and AWS data workflows for an award-recognised ecommerce optimisation platform.</w:t>
       </w:r>
     </w:p>
     <w:p>
@@ -508,7 +492,7 @@
         <w:rPr>
           <w:i w:val="0"/>
         </w:rPr>
-        <w:t xml:space="preserve"> · London · Mar 2023 – Nov 2023</w:t>
+        <w:t xml:space="preserve"> · London · Mar 2023 - Nov 2023</w:t>
       </w:r>
     </w:p>
     <w:p>
@@ -548,7 +532,7 @@
         <w:rPr>
           <w:i w:val="0"/>
         </w:rPr>
-        <w:t xml:space="preserve"> · London · Jan 2021 – Mar 2023</w:t>
+        <w:t xml:space="preserve"> · London · Jan 2021 - Mar 2023</w:t>
       </w:r>
     </w:p>
     <w:p>
@@ -588,7 +572,7 @@
         <w:rPr>
           <w:i w:val="0"/>
         </w:rPr>
-        <w:t xml:space="preserve"> · London · 2017 – 2020</w:t>
+        <w:t xml:space="preserve"> · London · 2017 - 2020</w:t>
       </w:r>
     </w:p>
     <w:p>
@@ -636,7 +620,7 @@
         <w:rPr>
           <w:i w:val="0"/>
         </w:rPr>
-        <w:t xml:space="preserve"> · 2009 – 2011</w:t>
+        <w:t xml:space="preserve"> · 2009 - 2011</w:t>
       </w:r>
     </w:p>
     <w:p>
@@ -662,7 +646,7 @@
         <w:rPr>
           <w:i w:val="0"/>
         </w:rPr>
-        <w:t xml:space="preserve"> · 2003 – 2007</w:t>
+        <w:t xml:space="preserve"> · 2003 - 2007</w:t>
       </w:r>
     </w:p>
     <w:sectPr>

</xml_diff>

<commit_message>
Improve profile and product narratives
</commit_message>
<xml_diff>
--- a/public/cv/Dessi_Georgieva_CV.docx
+++ b/public/cv/Dessi_Georgieva_CV.docx
@@ -114,7 +114,7 @@
         <w:rPr>
           <w:i w:val="0"/>
         </w:rPr>
-        <w:t>AI systems engineer building the layer between models and dependable products: tool execution, context construction, evaluation, evidence, failure recovery, and human control. I work primarily in Python, FastAPI, TypeScript, React, and AWS. My public projects explore how agent systems can learn while keeping decisions and provenance inspectable; my employer work includes backend services, data workflows, and multi-tenant platform infrastructure.</w:t>
+        <w:t>I design and build AI systems that use tools, test their outputs against evidence, and recover when something goes wrong. My experience spans open source projects and enterprise backend, data, and multi-tenant platforms.</w:t>
       </w:r>
     </w:p>
     <w:p>
@@ -122,7 +122,7 @@
         <w:pStyle w:val="Heading1"/>
       </w:pPr>
       <w:r>
-        <w:t>Technical Focus</w:t>
+        <w:t>AI Systems Capabilities</w:t>
       </w:r>
     </w:p>
     <w:p>
@@ -137,13 +137,55 @@
           <w:b/>
           <w:i w:val="0"/>
         </w:rPr>
-        <w:t>Agent systems:</w:t>
+        <w:t>AI operating environments:</w:t>
       </w:r>
       <w:r>
         <w:rPr>
           <w:i w:val="0"/>
         </w:rPr>
-        <w:t xml:space="preserve"> tool-use policy, execution state, approvals, idempotency, recovery, provider adapters, retrieval, streaming</w:t>
+        <w:t xml:space="preserve"> Design the people, agents, tools, data, rules, and surrounding systems that must work together to produce a useful result.</w:t>
+      </w:r>
+    </w:p>
+    <w:p>
+      <w:pPr>
+        <w:pStyle w:val="CVBullet"/>
+      </w:pPr>
+      <w:r>
+        <w:t xml:space="preserve">• </w:t>
+      </w:r>
+      <w:r>
+        <w:rPr>
+          <w:b/>
+          <w:i w:val="0"/>
+        </w:rPr>
+        <w:t>Context, memory, and capabilities:</w:t>
+      </w:r>
+      <w:r>
+        <w:rPr>
+          <w:i w:val="0"/>
+        </w:rPr>
+        <w:t xml:space="preserve"> Give agents the right information and reusable procedures for each task, with clear sources, scope, and limits.</w:t>
+      </w:r>
+    </w:p>
+    <w:p>
+      <w:pPr>
+        <w:pStyle w:val="CVBullet"/>
+      </w:pPr>
+      <w:r>
+        <w:t xml:space="preserve">• </w:t>
+      </w:r>
+      <w:r>
+        <w:rPr>
+          <w:b/>
+          <w:i w:val="0"/>
+        </w:rPr>
+        <w:t>Authority and human attention:</w:t>
+      </w:r>
+      <w:r>
+        <w:rPr>
+          <w:i w:val="0"/>
+        </w:rPr>
+        <w:t xml:space="preserve"> Define what an agent may decide, when it must ask, and how identity, permissions, approvals, and consequential actions stay under human and system control.</w:t>
       </w:r>
     </w:p>
     <w:p>
@@ -164,7 +206,7 @@
         <w:rPr>
           <w:i w:val="0"/>
         </w:rPr>
-        <w:t xml:space="preserve"> regression suites, deterministic replay, synthetic and observed validation, evidence ledgers, belief revision</w:t>
+        <w:t xml:space="preserve"> Test components, interactions, and end results, then turn failures, feedback, and observed outcomes into changes that can be reviewed and reversed.</w:t>
       </w:r>
     </w:p>
     <w:p>
@@ -179,34 +221,13 @@
           <w:b/>
           <w:i w:val="0"/>
         </w:rPr>
-        <w:t>Backend and data:</w:t>
+        <w:t>Reliability and recovery:</w:t>
       </w:r>
       <w:r>
         <w:rPr>
           <w:i w:val="0"/>
         </w:rPr>
-        <w:t xml:space="preserve"> Python, FastAPI, Pydantic, pytest, SQL, PostgreSQL, embeddings, clustering</w:t>
-      </w:r>
-    </w:p>
-    <w:p>
-      <w:pPr>
-        <w:pStyle w:val="CVBullet"/>
-      </w:pPr>
-      <w:r>
-        <w:t xml:space="preserve">• </w:t>
-      </w:r>
-      <w:r>
-        <w:rPr>
-          <w:b/>
-          <w:i w:val="0"/>
-        </w:rPr>
-        <w:t>Product and infrastructure:</w:t>
-      </w:r>
-      <w:r>
-        <w:rPr>
-          <w:i w:val="0"/>
-        </w:rPr>
-        <w:t xml:space="preserve"> TypeScript, React, Next.js, Astro, Node.js, AWS, Terraform, Docker, CI/CD</w:t>
+        <w:t xml:space="preserve"> Make long-running work observable and recoverable through explicit state, budgets, retries, receipts, fallback, cancellation, and rollback.</w:t>
       </w:r>
     </w:p>
     <w:p>
@@ -222,7 +243,7 @@
         <w:pStyle w:val="Heading2"/>
       </w:pPr>
       <w:r>
-        <w:t>Agentic Commerce Learning Loop</w:t>
+        <w:t>Human Systems Platform</w:t>
       </w:r>
     </w:p>
     <w:p>
@@ -233,16 +254,16 @@
         <w:rPr>
           <w:i/>
         </w:rPr>
-        <w:t xml:space="preserve">Collaborative public system · Active · </w:t>
+        <w:t xml:space="preserve">Founder product · Private development · </w:t>
       </w:r>
-      <w:hyperlink r:id="rId15">
+      <w:hyperlink r:id="rId13">
         <w:r>
           <w:rPr>
             <w:color w:val="2E74B5"/>
             <w:u w:val="single"/>
             <w:i/>
           </w:rPr>
-          <w:t>Repository</w:t>
+          <w:t>First public product</w:t>
         </w:r>
       </w:hyperlink>
     </w:p>
@@ -257,7 +278,7 @@
         <w:rPr>
           <w:i w:val="0"/>
         </w:rPr>
-        <w:t>Designed a supervised agent runtime with registry-pinned tools, policy preflight, immutable events, recovery paths, and external-agent job receipts.</w:t>
+        <w:t>I am developing Human Systems Platform as a founder-led product for people and organisations that need credible evidence of capability in AI-mediated work. It turns selected experience into private learning, owner-approved public evidence, and testable hypotheses about where that capability may create value.</w:t>
       </w:r>
     </w:p>
     <w:p>
@@ -271,7 +292,7 @@
         <w:rPr>
           <w:i w:val="0"/>
         </w:rPr>
-        <w:t>Built a governed feedback loop that separates synthetic validation, observed outcomes, belief revision, and human approval.</w:t>
+        <w:t>I designed it to bring together Dessi Space for private continuity, Learning Foundry for human and agent development, DG-OS for public profiles and discovery, and a planned Organization Foundry for the context organisations need.</w:t>
       </w:r>
     </w:p>
     <w:p>
@@ -292,7 +313,7 @@
         </w:rPr>
         <w:t xml:space="preserve">Submitted public system · Judging state preserved · </w:t>
       </w:r>
-      <w:hyperlink r:id="rId16">
+      <w:hyperlink r:id="rId15">
         <w:r>
           <w:rPr>
             <w:color w:val="2E74B5"/>
@@ -314,7 +335,7 @@
         <w:rPr>
           <w:i w:val="0"/>
         </w:rPr>
-        <w:t>Built an evaluated, approval-gated Codex capability backed by append-only evidence and deterministic projections.</w:t>
+        <w:t>I built Learning Foundry as a stand-alone learning product for people who want to learn with AI without treating an agent's successful output as proof of their own understanding. It helps them explain, test, apply, and revise what they learn while separately developing evaluated agent capabilities.</w:t>
       </w:r>
     </w:p>
     <w:p>
@@ -328,7 +349,7 @@
         <w:rPr>
           <w:i w:val="0"/>
         </w:rPr>
-        <w:t>Append-only evidence and deterministic projections preserve provenance.</w:t>
+        <w:t>Within Human Systems Platform, I use Learning Foundry to develop human understanding and separately governed agent capabilities while keeping the private learning ledger inside its own boundary.</w:t>
       </w:r>
     </w:p>
     <w:p>
@@ -356,7 +377,7 @@
             <w:u w:val="single"/>
             <w:i/>
           </w:rPr>
-          <w:t>Portfolio</w:t>
+          <w:t>First live profile</w:t>
         </w:r>
       </w:hyperlink>
     </w:p>
@@ -371,7 +392,7 @@
         <w:rPr>
           <w:i w:val="0"/>
         </w:rPr>
-        <w:t>Built a retrieval-backed agent interface with multiple provider adapters, streaming contracts, health checks, and explicit fallback controls.</w:t>
+        <w:t>I built DG-OS as a stand-alone public profile and discovery product where visitors can inspect a person's systems, evidence, writing, and development or ask questions grounded in reviewed public sources.</w:t>
       </w:r>
     </w:p>
     <w:p>
@@ -385,17 +406,70 @@
         <w:rPr>
           <w:i w:val="0"/>
         </w:rPr>
-        <w:t>Represents claims with provenance, confidence, visibility, and boundaries.</w:t>
+        <w:t>Within Human Systems Platform, I use DG-OS to publish owner-approved profiles for discovery. My profile is the first live public instance.</w:t>
       </w:r>
     </w:p>
     <w:p>
+      <w:pPr>
+        <w:pStyle w:val="Heading2"/>
+      </w:pPr>
       <w:r>
-        <w:br w:type="page"/>
+        <w:t>Agentic Commerce Learning Loop</w:t>
+      </w:r>
+    </w:p>
+    <w:p>
+      <w:pPr>
+        <w:spacing w:after="40"/>
+      </w:pPr>
+      <w:r>
+        <w:rPr>
+          <w:i/>
+        </w:rPr>
+        <w:t xml:space="preserve">Collaborative public system · Active · </w:t>
+      </w:r>
+      <w:hyperlink r:id="rId16">
+        <w:r>
+          <w:rPr>
+            <w:color w:val="2E74B5"/>
+            <w:u w:val="single"/>
+            <w:i/>
+          </w:rPr>
+          <w:t>Repository</w:t>
+        </w:r>
+      </w:hyperlink>
+    </w:p>
+    <w:p>
+      <w:pPr>
+        <w:pStyle w:val="CVBullet"/>
+      </w:pPr>
+      <w:r>
+        <w:t xml:space="preserve">• </w:t>
+      </w:r>
+      <w:r>
+        <w:rPr>
+          <w:i w:val="0"/>
+        </w:rPr>
+        <w:t>I built Agentic Commerce to help brands test and improve how they describe products for paid placements and organic agent-led discovery, without giving an AI system unchecked control over business actions.</w:t>
+      </w:r>
+    </w:p>
+    <w:p>
+      <w:pPr>
+        <w:pStyle w:val="CVBullet"/>
+      </w:pPr>
+      <w:r>
+        <w:t xml:space="preserve">• </w:t>
+      </w:r>
+      <w:r>
+        <w:rPr>
+          <w:i w:val="0"/>
+        </w:rPr>
+        <w:t>I designed a Bayesian-style learning loop that updates brand- and product-scoped beliefs as evidence arrives and carries supported patterns into later query and copy generation. It recommends whether to promote, revise, or reject each variant, while the supervised runtime keeps tools, evidence, memory, approvals, and recovery under explicit control.</w:t>
       </w:r>
     </w:p>
     <w:p>
       <w:pPr>
         <w:pStyle w:val="Heading1"/>
+        <w:pageBreakBefore/>
       </w:pPr>
       <w:r>
         <w:t>Experience</w:t>
@@ -438,7 +512,7 @@
         <w:rPr>
           <w:i w:val="0"/>
         </w:rPr>
-        <w:t>Design and build AI and data systems spanning FastAPI services, AWS workflows, multi-tenant platform controls, behavioural modelling, and marketing-intelligence interfaces.</w:t>
+        <w:t>I design and build AI and data systems spanning backend services, cloud workflows, identity and policy controls, multi-tenant infrastructure, behavioural modelling, and marketing-intelligence interfaces.</w:t>
       </w:r>
     </w:p>
     <w:p>
@@ -452,7 +526,7 @@
         <w:rPr>
           <w:i w:val="0"/>
         </w:rPr>
-        <w:t>Delivered FastAPI services and AWS data workflows for an award-recognised ecommerce optimisation platform.</w:t>
+        <w:t>I build the Programmatic plugin and its agent harness across skill selection, a typed interface and backend tools, tenant-bound execution policy, human approval, evidence handling, and recovery.</w:t>
       </w:r>
     </w:p>
     <w:p>
@@ -466,7 +540,21 @@
         <w:rPr>
           <w:i w:val="0"/>
         </w:rPr>
-        <w:t>Employer code, client information, operational measurements, and infrastructure remain confidential; public descriptions are intentionally limited to responsibilities and outcomes.</w:t>
+        <w:t>I delivered backend services and cloud data workflows for an award-recognised ecommerce optimisation platform.</w:t>
+      </w:r>
+    </w:p>
+    <w:p>
+      <w:pPr>
+        <w:pStyle w:val="CVBullet"/>
+      </w:pPr>
+      <w:r>
+        <w:t xml:space="preserve">• </w:t>
+      </w:r>
+      <w:r>
+        <w:rPr>
+          <w:i w:val="0"/>
+        </w:rPr>
+        <w:t>I describe employer work only at responsibility and outcome level. Employer code, client information, operational measurements, and infrastructure remain confidential.</w:t>
       </w:r>
     </w:p>
     <w:p>
@@ -506,7 +594,7 @@
         <w:rPr>
           <w:i w:val="0"/>
         </w:rPr>
-        <w:t>Bridged marketing analytics and decision systems, moving reporting workflows toward reusable intelligence services and platformised decision support.</w:t>
+        <w:t>I bridged marketing analytics and decision systems, moving reporting workflows toward reusable intelligence services and platformised decision support.</w:t>
       </w:r>
     </w:p>
     <w:p>
@@ -546,7 +634,7 @@
         <w:rPr>
           <w:i w:val="0"/>
         </w:rPr>
-        <w:t>Built enterprise analytics applications and data workflows, including Shiny applications, AWS ETL, and data-lake patterns.</w:t>
+        <w:t>I built enterprise analytics applications and data workflows, including interactive products, cloud ETL, and data-lake patterns.</w:t>
       </w:r>
     </w:p>
     <w:p>
@@ -586,7 +674,7 @@
         <w:rPr>
           <w:i w:val="0"/>
         </w:rPr>
-        <w:t>Delivered CRM, analytics, segmentation, automation, and experimentation systems for agencies, startups, and media organisations.</w:t>
+        <w:t>I delivered CRM, analytics, segmentation, automation, and experimentation systems for agencies, startups, and media organisations.</w:t>
       </w:r>
     </w:p>
     <w:p>

</xml_diff>

<commit_message>
feat: strengthen production systems profile
</commit_message>
<xml_diff>
--- a/public/cv/Dessi_Georgieva_CV.docx
+++ b/public/cv/Dessi_Georgieva_CV.docx
@@ -114,7 +114,7 @@
         <w:rPr>
           <w:i w:val="0"/>
         </w:rPr>
-        <w:t>I design and build AI systems that use tools, test their outputs against evidence, and recover when something goes wrong. My experience spans open source projects and enterprise backend, data, and multi-tenant platforms.</w:t>
+        <w:t>I architect and build enterprise AI systems that interpret user intent, coordinate skills and tools, work across hierarchical external systems, and return results under explicit identity, policy, and evidence controls. My professional work provides production backend, data, and multi-tenant experience; my independent systems make the corresponding architecture, evaluation, and recovery patterns inspectable.</w:t>
       </w:r>
     </w:p>
     <w:p>
@@ -243,6 +243,120 @@
         <w:pStyle w:val="Heading2"/>
       </w:pPr>
       <w:r>
+        <w:t>Agentic Commerce Learning Loop</w:t>
+      </w:r>
+    </w:p>
+    <w:p>
+      <w:pPr>
+        <w:spacing w:after="40"/>
+      </w:pPr>
+      <w:r>
+        <w:rPr>
+          <w:i/>
+        </w:rPr>
+        <w:t xml:space="preserve">Collaborative public system · Active · </w:t>
+      </w:r>
+      <w:hyperlink r:id="rId15">
+        <w:r>
+          <w:rPr>
+            <w:color w:val="2E74B5"/>
+            <w:u w:val="single"/>
+            <w:i/>
+          </w:rPr>
+          <w:t>Repository</w:t>
+        </w:r>
+      </w:hyperlink>
+    </w:p>
+    <w:p>
+      <w:pPr>
+        <w:pStyle w:val="CVBullet"/>
+      </w:pPr>
+      <w:r>
+        <w:t xml:space="preserve">• </w:t>
+      </w:r>
+      <w:r>
+        <w:rPr>
+          <w:i w:val="0"/>
+        </w:rPr>
+        <w:t>I built Agentic Commerce to help brands test and improve how they describe products for paid placements and organic agent-led discovery, without giving an AI system unchecked control over business actions.</w:t>
+      </w:r>
+    </w:p>
+    <w:p>
+      <w:pPr>
+        <w:pStyle w:val="CVBullet"/>
+      </w:pPr>
+      <w:r>
+        <w:t xml:space="preserve">• </w:t>
+      </w:r>
+      <w:r>
+        <w:rPr>
+          <w:i w:val="0"/>
+        </w:rPr>
+        <w:t>I designed a Bayesian-style learning loop that updates brand- and product-scoped beliefs as evidence arrives and carries supported patterns into later query and copy generation. It recommends whether to promote, revise, or reject each variant, while the supervised runtime keeps tools, evidence, memory, approvals, and recovery under explicit control.</w:t>
+      </w:r>
+    </w:p>
+    <w:p>
+      <w:pPr>
+        <w:pStyle w:val="Heading2"/>
+      </w:pPr>
+      <w:r>
+        <w:t>Gateplane Agent Control Plane</w:t>
+      </w:r>
+    </w:p>
+    <w:p>
+      <w:pPr>
+        <w:spacing w:after="40"/>
+      </w:pPr>
+      <w:r>
+        <w:rPr>
+          <w:i/>
+        </w:rPr>
+        <w:t xml:space="preserve">Independent deployed beta · Private source · </w:t>
+      </w:r>
+      <w:hyperlink r:id="rId16">
+        <w:r>
+          <w:rPr>
+            <w:color w:val="2E74B5"/>
+            <w:u w:val="single"/>
+            <w:i/>
+          </w:rPr>
+          <w:t>Public overview</w:t>
+        </w:r>
+      </w:hyperlink>
+    </w:p>
+    <w:p>
+      <w:pPr>
+        <w:pStyle w:val="CVBullet"/>
+      </w:pPr>
+      <w:r>
+        <w:t xml:space="preserve">• </w:t>
+      </w:r>
+      <w:r>
+        <w:rPr>
+          <w:i w:val="0"/>
+        </w:rPr>
+        <w:t>I developed Gateplane independently to explore how authenticated human or agent identity becomes bounded, tenant-aware authority for tools and external effects.</w:t>
+      </w:r>
+    </w:p>
+    <w:p>
+      <w:pPr>
+        <w:pStyle w:val="CVBullet"/>
+      </w:pPr>
+      <w:r>
+        <w:t xml:space="preserve">• </w:t>
+      </w:r>
+      <w:r>
+        <w:rPr>
+          <w:i w:val="0"/>
+        </w:rPr>
+        <w:t>The product overview is public; source code and provisioned access remain private, and employer deployment or production adoption is not claimed.</w:t>
+      </w:r>
+    </w:p>
+    <w:p>
+      <w:pPr>
+        <w:pStyle w:val="Heading2"/>
+      </w:pPr>
+      <w:r>
         <w:t>Human Systems Platform</w:t>
       </w:r>
     </w:p>
@@ -313,7 +427,7 @@
         </w:rPr>
         <w:t xml:space="preserve">Submitted public system · Judging state preserved · </w:t>
       </w:r>
-      <w:hyperlink r:id="rId15">
+      <w:hyperlink r:id="rId17">
         <w:r>
           <w:rPr>
             <w:color w:val="2E74B5"/>
@@ -336,134 +450,6 @@
           <w:i w:val="0"/>
         </w:rPr>
         <w:t>I built Learning Foundry as a stand-alone learning product for people who want to learn with AI without treating an agent's successful output as proof of their own understanding. It helps them explain, test, apply, and revise what they learn while separately developing evaluated agent capabilities.</w:t>
-      </w:r>
-    </w:p>
-    <w:p>
-      <w:pPr>
-        <w:pStyle w:val="CVBullet"/>
-      </w:pPr>
-      <w:r>
-        <w:t xml:space="preserve">• </w:t>
-      </w:r>
-      <w:r>
-        <w:rPr>
-          <w:i w:val="0"/>
-        </w:rPr>
-        <w:t>Within Human Systems Platform, I use Learning Foundry to develop human understanding and separately governed agent capabilities while keeping the private learning ledger inside its own boundary.</w:t>
-      </w:r>
-    </w:p>
-    <w:p>
-      <w:pPr>
-        <w:pStyle w:val="Heading2"/>
-      </w:pPr>
-      <w:r>
-        <w:t>DG-OS</w:t>
-      </w:r>
-    </w:p>
-    <w:p>
-      <w:pPr>
-        <w:spacing w:after="40"/>
-      </w:pPr>
-      <w:r>
-        <w:rPr>
-          <w:i/>
-        </w:rPr>
-        <w:t xml:space="preserve">Personal public system · Active · </w:t>
-      </w:r>
-      <w:hyperlink r:id="rId13">
-        <w:r>
-          <w:rPr>
-            <w:color w:val="2E74B5"/>
-            <w:u w:val="single"/>
-            <w:i/>
-          </w:rPr>
-          <w:t>First live profile</w:t>
-        </w:r>
-      </w:hyperlink>
-    </w:p>
-    <w:p>
-      <w:pPr>
-        <w:pStyle w:val="CVBullet"/>
-      </w:pPr>
-      <w:r>
-        <w:t xml:space="preserve">• </w:t>
-      </w:r>
-      <w:r>
-        <w:rPr>
-          <w:i w:val="0"/>
-        </w:rPr>
-        <w:t>I built DG-OS as a stand-alone public profile and discovery product where visitors can inspect a person's systems, evidence, writing, and development or ask questions grounded in reviewed public sources.</w:t>
-      </w:r>
-    </w:p>
-    <w:p>
-      <w:pPr>
-        <w:pStyle w:val="CVBullet"/>
-      </w:pPr>
-      <w:r>
-        <w:t xml:space="preserve">• </w:t>
-      </w:r>
-      <w:r>
-        <w:rPr>
-          <w:i w:val="0"/>
-        </w:rPr>
-        <w:t>Within Human Systems Platform, I use DG-OS to publish owner-approved profiles for discovery. My profile is the first live public instance.</w:t>
-      </w:r>
-    </w:p>
-    <w:p>
-      <w:pPr>
-        <w:pStyle w:val="Heading2"/>
-      </w:pPr>
-      <w:r>
-        <w:t>Agentic Commerce Learning Loop</w:t>
-      </w:r>
-    </w:p>
-    <w:p>
-      <w:pPr>
-        <w:spacing w:after="40"/>
-      </w:pPr>
-      <w:r>
-        <w:rPr>
-          <w:i/>
-        </w:rPr>
-        <w:t xml:space="preserve">Collaborative public system · Active · </w:t>
-      </w:r>
-      <w:hyperlink r:id="rId16">
-        <w:r>
-          <w:rPr>
-            <w:color w:val="2E74B5"/>
-            <w:u w:val="single"/>
-            <w:i/>
-          </w:rPr>
-          <w:t>Repository</w:t>
-        </w:r>
-      </w:hyperlink>
-    </w:p>
-    <w:p>
-      <w:pPr>
-        <w:pStyle w:val="CVBullet"/>
-      </w:pPr>
-      <w:r>
-        <w:t xml:space="preserve">• </w:t>
-      </w:r>
-      <w:r>
-        <w:rPr>
-          <w:i w:val="0"/>
-        </w:rPr>
-        <w:t>I built Agentic Commerce to help brands test and improve how they describe products for paid placements and organic agent-led discovery, without giving an AI system unchecked control over business actions.</w:t>
-      </w:r>
-    </w:p>
-    <w:p>
-      <w:pPr>
-        <w:pStyle w:val="CVBullet"/>
-      </w:pPr>
-      <w:r>
-        <w:t xml:space="preserve">• </w:t>
-      </w:r>
-      <w:r>
-        <w:rPr>
-          <w:i w:val="0"/>
-        </w:rPr>
-        <w:t>I designed a Bayesian-style learning loop that updates brand- and product-scoped beliefs as evidence arrives and carries supported patterns into later query and copy generation. It recommends whether to promote, revise, or reject each variant, while the supervised runtime keeps tools, evidence, memory, approvals, and recovery under explicit control.</w:t>
       </w:r>
     </w:p>
     <w:p>
@@ -512,7 +498,7 @@
         <w:rPr>
           <w:i w:val="0"/>
         </w:rPr>
-        <w:t>I design and build AI and data systems spanning backend services, cloud workflows, identity and policy controls, multi-tenant infrastructure, behavioural modelling, and marketing-intelligence interfaces.</w:t>
+        <w:t>I map production request-to-response lifecycles and am leading architecture work for evidence-led final-answer validation; this remains in delivery rather than a deployed control.</w:t>
       </w:r>
     </w:p>
     <w:p>
@@ -526,7 +512,21 @@
         <w:rPr>
           <w:i w:val="0"/>
         </w:rPr>
-        <w:t>I build the Programmatic plugin and its agent harness across skill selection, a typed interface and backend tools, tenant-bound execution policy, human approval, evidence handling, and recovery.</w:t>
+        <w:t>I architect and build the Programmatic plugin and agent harness that turns ambiguous user requests into tenant-bound execution across skills, a typed CLI, backend services, analytical data, and advertising-platform APIs.</w:t>
+      </w:r>
+    </w:p>
+    <w:p>
+      <w:pPr>
+        <w:pStyle w:val="CVBullet"/>
+      </w:pPr>
+      <w:r>
+        <w:t xml:space="preserve">• </w:t>
+      </w:r>
+      <w:r>
+        <w:rPr>
+          <w:i w:val="0"/>
+        </w:rPr>
+        <w:t>I build backend ingestion and serving workflows for heterogeneous advertising data across provider hierarchies and analytical grains, and evaluate storage architecture against query shape, aggregation, latency, reliability, and cost.</w:t>
       </w:r>
     </w:p>
     <w:p>

</xml_diff>